<commit_message>
Complete methodological manuscript quality pass
</commit_message>
<xml_diff>
--- a/HBBMAAD_anonymous_methodological_review.docx
+++ b/HBBMAAD_anonymous_methodological_review.docx
@@ -34,7 +34,7 @@
     </w:p>
     <w:p>
       <w:pPr>
-        <w:spacing w:after="560"/>
+        <w:spacing w:after="160"/>
         <w:jc w:val="center"/>
       </w:pPr>
       <w:r>
@@ -44,6 +44,21 @@
           <w:sz w:val="20"/>
         </w:rPr>
         <w:t>Anonymous submission for independent methodological feedback</w:t>
+      </w:r>
+    </w:p>
+    <w:p>
+      <w:pPr>
+        <w:spacing w:after="400"/>
+        <w:jc w:val="center"/>
+      </w:pPr>
+      <w:r>
+        <w:rPr>
+          <w:rFonts w:ascii="Calibri" w:hAnsi="Calibri"/>
+          <w:b/>
+          <w:color w:val="2E74B5"/>
+          <w:sz w:val="19"/>
+        </w:rPr>
+        <w:t>Audience and scope: a specialized cybersecurity measurement paper for endpoint security and security-ML venues, written to remain accessible to general cybersecurity reviewers. ML is used for comparison, not presented as a new detector architecture.</w:t>
       </w:r>
     </w:p>
     <w:p>
@@ -131,6 +146,29 @@
     </w:p>
     <w:p>
       <w:pPr>
+        <w:pStyle w:val="Heading2"/>
+        <w:keepNext/>
+      </w:pPr>
+      <w:r>
+        <w:t>1.1 Reader guide: endpoint telemetry and metrics</w:t>
+      </w:r>
+    </w:p>
+    <w:p>
+      <w:pPr>
+        <w:spacing w:after="120" w:line="271" w:lineRule="auto"/>
+        <w:jc w:val="both"/>
+      </w:pPr>
+      <w:r>
+        <w:rPr>
+          <w:rFonts w:ascii="Calibri" w:hAnsi="Calibri"/>
+          <w:i w:val="0"/>
+          <w:sz w:val="21"/>
+        </w:rPr>
+        <w:t>Sysmon is a Windows endpoint logging service that records events such as process creation, file activity, registry changes, and network connections. This study groups those events into five-minute windows and labels a window as ransomware or benign. Precision is the fraction of alerts that are ransomware, recall is the fraction of ransomware windows detected, and F1 is their harmonic mean on a 0-to-1 scale. AUC measures how well model scores rank ransomware above benign windows across thresholds. FPR is the fraction of benign windows incorrectly alerted, and recall@1%FPR reports the attacks found after a threshold is selected for a 1% validation false-positive target. A 95% confidence interval summarizes variation across the seven held-out families; none of these values is a deployment guarantee.</w:t>
+      </w:r>
+    </w:p>
+    <w:p>
+      <w:pPr>
         <w:pStyle w:val="Heading1"/>
         <w:keepNext/>
       </w:pPr>
@@ -164,6 +202,84 @@
           <w:sz w:val="21"/>
         </w:rPr>
         <w:t>The representation intentionally uses what the source Sysmon logs can recover. It does not claim CPU, memory, raw file entropy, or complete enterprise context. Goodware is represented by a single run; therefore, the benign test pool is a random 20% split, not a separate session-disjoint goodware population.</w:t>
+      </w:r>
+    </w:p>
+    <w:p>
+      <w:pPr>
+        <w:pStyle w:val="Heading2"/>
+        <w:keepNext/>
+      </w:pPr>
+      <w:r>
+        <w:t>2.1 Experimental system and evaluation architecture</w:t>
+      </w:r>
+    </w:p>
+    <w:p>
+      <w:pPr>
+        <w:spacing w:after="120" w:line="271" w:lineRule="auto"/>
+        <w:jc w:val="both"/>
+      </w:pPr>
+      <w:r>
+        <w:rPr>
+          <w:rFonts w:ascii="Calibri" w:hAnsi="Calibri"/>
+          <w:i w:val="0"/>
+          <w:sz w:val="21"/>
+        </w:rPr>
+        <w:t>The author did not execute ransomware or construct the RADAR laboratory environment. The experiment begins with the released Sysmon logs. Figure 1 separates the dataset provider's controlled endpoint executions from the author-controlled event aggregation, strict family split, inner validation, detector fitting, and final scoring. Family labels construct the outer split but are not predictive features. Each detector is tested once on the unseen ransomware family plus the fixed benign pool after all tuning decisions have been made without those test labels.</w:t>
+      </w:r>
+    </w:p>
+    <w:p>
+      <w:pPr>
+        <w:spacing w:after="60"/>
+        <w:jc w:val="center"/>
+      </w:pPr>
+      <w:r>
+        <w:drawing>
+          <wp:inline xmlns:a="http://schemas.openxmlformats.org/drawingml/2006/main" xmlns:pic="http://schemas.openxmlformats.org/drawingml/2006/picture">
+            <wp:extent cx="6035040" cy="3272833"/>
+            <wp:docPr id="1" name="Picture 1" descr="RADAR ransomware and goodware Sysmon logs are aggregated into five-minute windows, separated by ransomware family, tuned using only training and validation data, and evaluated once on an unseen family plus a fixed benign pool." title="RADAR unseen-family evaluation architecture"/>
+            <wp:cNvGraphicFramePr>
+              <a:graphicFrameLocks noChangeAspect="1"/>
+            </wp:cNvGraphicFramePr>
+            <a:graphic>
+              <a:graphicData uri="http://schemas.openxmlformats.org/drawingml/2006/picture">
+                <pic:pic>
+                  <pic:nvPicPr>
+                    <pic:cNvPr id="0" name="evaluation_architecture.png"/>
+                    <pic:cNvPicPr/>
+                  </pic:nvPicPr>
+                  <pic:blipFill>
+                    <a:blip r:embed="rId11"/>
+                    <a:stretch>
+                      <a:fillRect/>
+                    </a:stretch>
+                  </pic:blipFill>
+                  <pic:spPr>
+                    <a:xfrm>
+                      <a:off x="0" y="0"/>
+                      <a:ext cx="6035040" cy="3272833"/>
+                    </a:xfrm>
+                    <a:prstGeom prst="rect"/>
+                  </pic:spPr>
+                </pic:pic>
+              </a:graphicData>
+            </a:graphic>
+          </wp:inline>
+        </w:drawing>
+      </w:r>
+    </w:p>
+    <w:p>
+      <w:pPr>
+        <w:spacing w:after="140"/>
+        <w:jc w:val="center"/>
+      </w:pPr>
+      <w:r>
+        <w:rPr>
+          <w:rFonts w:ascii="Calibri" w:hAnsi="Calibri"/>
+          <w:i/>
+          <w:color w:val="555555"/>
+          <w:sz w:val="17"/>
+        </w:rPr>
+        <w:t>Figure 1. Dataset-provider executions and the author-controlled offline evaluation boundary.</w:t>
       </w:r>
     </w:p>
     <w:p>
@@ -299,7 +415,7 @@
           <w:i w:val="0"/>
           <w:sz w:val="21"/>
         </w:rPr>
-        <w:t>Under the strict family protocol, the supervised Random Forest was the strongest individual learned detector. The unweighted vote had slightly higher macro F1 but lower AUC is not defined for its binary vote. The weighted ensemble was highly precise but recalled few attacks. The rules were intentionally conservative and the progression detector did not flag RADAR trajectories because the available per-host groups were too short to establish the required three-stage sequence.</w:t>
+        <w:t>Under the strict family protocol, the supervised Random Forest was the strongest individual learned detector. The unweighted vote had slightly higher macro F1, but AUC is undefined for its binary vote. The weighted ensemble was highly precise but recalled few attacks. The rules were intentionally conservative, and the progression detector did not flag RADAR trajectories because the available per-host groups were too short to establish the required three-stage sequence.</w:t>
       </w:r>
     </w:p>
     <w:tbl>
@@ -328,9 +444,9 @@
           <w:tcPr>
             <w:tcW w:type="dxa" w:w="2050"/>
             <w:tcMar>
-              <w:top w:w="80" w:type="dxa"/>
+              <w:top w:w="55" w:type="dxa"/>
               <w:start w:w="120" w:type="dxa"/>
-              <w:bottom w:w="80" w:type="dxa"/>
+              <w:bottom w:w="55" w:type="dxa"/>
               <w:end w:w="120" w:type="dxa"/>
             </w:tcMar>
             <w:vAlign w:val="center"/>
@@ -355,9 +471,9 @@
           <w:tcPr>
             <w:tcW w:type="dxa" w:w="1450"/>
             <w:tcMar>
-              <w:top w:w="80" w:type="dxa"/>
+              <w:top w:w="55" w:type="dxa"/>
               <w:start w:w="120" w:type="dxa"/>
-              <w:bottom w:w="80" w:type="dxa"/>
+              <w:bottom w:w="55" w:type="dxa"/>
               <w:end w:w="120" w:type="dxa"/>
             </w:tcMar>
             <w:vAlign w:val="center"/>
@@ -382,9 +498,9 @@
           <w:tcPr>
             <w:tcW w:type="dxa" w:w="1050"/>
             <w:tcMar>
-              <w:top w:w="80" w:type="dxa"/>
+              <w:top w:w="55" w:type="dxa"/>
               <w:start w:w="120" w:type="dxa"/>
-              <w:bottom w:w="80" w:type="dxa"/>
+              <w:bottom w:w="55" w:type="dxa"/>
               <w:end w:w="120" w:type="dxa"/>
             </w:tcMar>
             <w:vAlign w:val="center"/>
@@ -409,9 +525,9 @@
           <w:tcPr>
             <w:tcW w:type="dxa" w:w="950"/>
             <w:tcMar>
-              <w:top w:w="80" w:type="dxa"/>
+              <w:top w:w="55" w:type="dxa"/>
               <w:start w:w="120" w:type="dxa"/>
-              <w:bottom w:w="80" w:type="dxa"/>
+              <w:bottom w:w="55" w:type="dxa"/>
               <w:end w:w="120" w:type="dxa"/>
             </w:tcMar>
             <w:vAlign w:val="center"/>
@@ -436,9 +552,9 @@
           <w:tcPr>
             <w:tcW w:type="dxa" w:w="850"/>
             <w:tcMar>
-              <w:top w:w="80" w:type="dxa"/>
+              <w:top w:w="55" w:type="dxa"/>
               <w:start w:w="120" w:type="dxa"/>
-              <w:bottom w:w="80" w:type="dxa"/>
+              <w:bottom w:w="55" w:type="dxa"/>
               <w:end w:w="120" w:type="dxa"/>
             </w:tcMar>
             <w:vAlign w:val="center"/>
@@ -463,9 +579,9 @@
           <w:tcPr>
             <w:tcW w:type="dxa" w:w="2200"/>
             <w:tcMar>
-              <w:top w:w="80" w:type="dxa"/>
+              <w:top w:w="55" w:type="dxa"/>
               <w:start w:w="120" w:type="dxa"/>
-              <w:bottom w:w="80" w:type="dxa"/>
+              <w:bottom w:w="55" w:type="dxa"/>
               <w:end w:w="120" w:type="dxa"/>
             </w:tcMar>
             <w:vAlign w:val="center"/>
@@ -1321,6 +1437,28 @@
     </w:p>
     <w:p>
       <w:pPr>
+        <w:spacing w:after="140" w:line="252" w:lineRule="auto"/>
+        <w:ind w:left="173" w:right="115"/>
+      </w:pPr>
+      <w:r>
+        <w:rPr>
+          <w:rFonts w:ascii="Calibri" w:hAnsi="Calibri"/>
+          <w:b/>
+          <w:color w:val="2E74B5"/>
+          <w:sz w:val="17"/>
+        </w:rPr>
+        <w:t xml:space="preserve">How to read this table. </w:t>
+      </w:r>
+      <w:r>
+        <w:rPr>
+          <w:rFonts w:ascii="Calibri" w:hAnsi="Calibri"/>
+          <w:sz w:val="17"/>
+        </w:rPr>
+        <w:t>The Random Forest row means that roughly 35% of its alerts were ransomware windows (precision 0.347) and it detected roughly 53% of ransomware windows (recall 0.531), producing F1 0.400. AUC 0.809 indicates useful but imperfect ranking. When its threshold was selected for a 1% validation FPR target, recall fell to 0.166, showing the cost of limiting false alerts.</w:t>
+      </w:r>
+    </w:p>
+    <w:p>
+      <w:pPr>
         <w:spacing w:after="120" w:line="271" w:lineRule="auto"/>
         <w:jc w:val="both"/>
       </w:pPr>
@@ -1359,9 +1497,9 @@
           <w:tcPr>
             <w:tcW w:type="dxa" w:w="1750"/>
             <w:tcMar>
-              <w:top w:w="80" w:type="dxa"/>
+              <w:top w:w="55" w:type="dxa"/>
               <w:start w:w="120" w:type="dxa"/>
-              <w:bottom w:w="80" w:type="dxa"/>
+              <w:bottom w:w="55" w:type="dxa"/>
               <w:end w:w="120" w:type="dxa"/>
             </w:tcMar>
             <w:vAlign w:val="center"/>
@@ -1386,9 +1524,9 @@
           <w:tcPr>
             <w:tcW w:type="dxa" w:w="1200"/>
             <w:tcMar>
-              <w:top w:w="80" w:type="dxa"/>
+              <w:top w:w="55" w:type="dxa"/>
               <w:start w:w="120" w:type="dxa"/>
-              <w:bottom w:w="80" w:type="dxa"/>
+              <w:bottom w:w="55" w:type="dxa"/>
               <w:end w:w="120" w:type="dxa"/>
             </w:tcMar>
             <w:vAlign w:val="center"/>
@@ -1413,9 +1551,9 @@
           <w:tcPr>
             <w:tcW w:type="dxa" w:w="1000"/>
             <w:tcMar>
-              <w:top w:w="80" w:type="dxa"/>
+              <w:top w:w="55" w:type="dxa"/>
               <w:start w:w="120" w:type="dxa"/>
-              <w:bottom w:w="80" w:type="dxa"/>
+              <w:bottom w:w="55" w:type="dxa"/>
               <w:end w:w="120" w:type="dxa"/>
             </w:tcMar>
             <w:vAlign w:val="center"/>
@@ -1440,9 +1578,9 @@
           <w:tcPr>
             <w:tcW w:type="dxa" w:w="1000"/>
             <w:tcMar>
-              <w:top w:w="80" w:type="dxa"/>
+              <w:top w:w="55" w:type="dxa"/>
               <w:start w:w="120" w:type="dxa"/>
-              <w:bottom w:w="80" w:type="dxa"/>
+              <w:bottom w:w="55" w:type="dxa"/>
               <w:end w:w="120" w:type="dxa"/>
             </w:tcMar>
             <w:vAlign w:val="center"/>
@@ -1467,9 +1605,9 @@
           <w:tcPr>
             <w:tcW w:type="dxa" w:w="1550"/>
             <w:tcMar>
-              <w:top w:w="80" w:type="dxa"/>
+              <w:top w:w="55" w:type="dxa"/>
               <w:start w:w="120" w:type="dxa"/>
-              <w:bottom w:w="80" w:type="dxa"/>
+              <w:bottom w:w="55" w:type="dxa"/>
               <w:end w:w="120" w:type="dxa"/>
             </w:tcMar>
             <w:vAlign w:val="center"/>
@@ -1494,9 +1632,9 @@
           <w:tcPr>
             <w:tcW w:type="dxa" w:w="2860"/>
             <w:tcMar>
-              <w:top w:w="80" w:type="dxa"/>
+              <w:top w:w="55" w:type="dxa"/>
               <w:start w:w="120" w:type="dxa"/>
-              <w:bottom w:w="80" w:type="dxa"/>
+              <w:bottom w:w="55" w:type="dxa"/>
               <w:end w:w="120" w:type="dxa"/>
             </w:tcMar>
             <w:vAlign w:val="center"/>
@@ -2352,6 +2490,28 @@
     </w:p>
     <w:p>
       <w:pPr>
+        <w:spacing w:after="140" w:line="252" w:lineRule="auto"/>
+        <w:ind w:left="173" w:right="115"/>
+      </w:pPr>
+      <w:r>
+        <w:rPr>
+          <w:rFonts w:ascii="Calibri" w:hAnsi="Calibri"/>
+          <w:b/>
+          <w:color w:val="2E74B5"/>
+          <w:sz w:val="17"/>
+        </w:rPr>
+        <w:t xml:space="preserve">How to read this table. </w:t>
+      </w:r>
+      <w:r>
+        <w:rPr>
+          <w:rFonts w:ascii="Calibri" w:hAnsi="Calibri"/>
+          <w:sz w:val="17"/>
+        </w:rPr>
+        <w:t>The Lynx row contains 56 held-out ransomware windows. F1 0.429 and AUC 0.861 show moderate fixed-threshold detection but stronger ranking. At the validation-selected 1% FPR operating point, recall was 0.268; the unseen-family test FPR reached 0.011, illustrating that validation calibration cannot guarantee the same false-positive rate after a family shift.</w:t>
+      </w:r>
+    </w:p>
+    <w:p>
+      <w:pPr>
         <w:pStyle w:val="Heading1"/>
         <w:keepNext/>
       </w:pPr>
@@ -2463,6 +2623,19 @@
     </w:p>
     <w:p>
       <w:pPr>
+        <w:pStyle w:val="ListBullet"/>
+        <w:spacing w:after="60" w:line="264" w:lineRule="auto"/>
+      </w:pPr>
+      <w:r>
+        <w:rPr>
+          <w:rFonts w:ascii="Calibri" w:hAnsi="Calibri"/>
+          <w:sz w:val="20"/>
+        </w:rPr>
+        <w:t>RADAR's published drift and class-imbalance scenarios are not evaluated here; this manuscript tests family holdout on the reconstructed window representation.</w:t>
+      </w:r>
+    </w:p>
+    <w:p>
+      <w:pPr>
         <w:pStyle w:val="Heading1"/>
         <w:keepNext/>
       </w:pPr>
@@ -2504,7 +2677,7 @@
           <w:i w:val="0"/>
           <w:sz w:val="21"/>
         </w:rPr>
-        <w:t>Repository (anonymized for review): github.com/Farooq-Syed/host-based-behavioral-monitoring-and-anomaly-detection. Entry points: radar_strict_eval.py (strict leave-one-family-out evaluation), sysmon_adapter.py (raw-log to windowed telemetry), real_data_eval.py (development random-CV), plus scripts/reproduce_radar.py and scripts/download_real_data.py. Frozen preprocessing (window size, feature list, seeds, label rule) is recorded in radar_manifest.json and requirements-lock.txt.</w:t>
+        <w:t>Repository URL: withheld from this manuscript for double-blind review and available through an anonymous artifact when venue policy permits. Entry points: radar_strict_eval.py (strict leave-one-family-out evaluation), sysmon_adapter.py (raw-log to windowed telemetry), real_data_eval.py (development random-CV), plus scripts/reproduce_radar.py and scripts/download_real_data.py. Frozen preprocessing (window size, feature list, seeds, label rule) is recorded in radar_manifest.json and requirements-lock.txt.</w:t>
       </w:r>
     </w:p>
     <w:p>
@@ -2518,7 +2691,7 @@
           <w:i w:val="0"/>
           <w:sz w:val="21"/>
         </w:rPr>
-        <w:t>Data attribution and license. RADAR (J. Ispahany, M. R. Islam, M. A. Khan, M. Z. Islam, “RADAR: a realistic dataset for advancing ransomware detection”), Zenodo doi:10.5281/zenodo.14564541, CC BY 4.0. It is a public research dataset; the code and this manuscript are released under the repository's Non-Commercial Personal-Use License.</w:t>
+        <w:t>Data attribution and license. RADAR (J. Ispahany et al., Journal of Cybersecurity, doi:10.1186/s42400-025-00435-9), Zenodo doi:10.5281/zenodo.14564541, CC BY 4.0. It is a public research dataset; the code and this manuscript are released under the repository's Non-Commercial Personal-Use License.</w:t>
       </w:r>
     </w:p>
     <w:p>
@@ -2600,7 +2773,7 @@
           <w:rFonts w:ascii="Calibri" w:hAnsi="Calibri"/>
           <w:sz w:val="18"/>
         </w:rPr>
-        <w:t>[1] J. Ispahany, M. R. Islam, M. A. Khan, and M. Z. Islam. RADAR: A realistic dataset for advancing ransomware detection. Zenodo, doi:10.5281/zenodo.14564541.</w:t>
+        <w:t>[1] J. Ispahany, O. B. Deho, M. R. Islam, M. A. Khan, and M. Z. Islam. RADAR: A realistic dataset for advancing ransomware detection. Journal of Cybersecurity 9(1), 2026. doi:10.1186/s42400-025-00435-9.</w:t>
       </w:r>
     </w:p>
     <w:p>
@@ -2613,7 +2786,7 @@
           <w:rFonts w:ascii="Calibri" w:hAnsi="Calibri"/>
           <w:sz w:val="18"/>
         </w:rPr>
-        <w:t>[2] F. T. Liu, K. M. Ting, and Z.-H. Zhou. Isolation Forest. 2008 IEEE International Conference on Data Mining, 2008.</w:t>
+        <w:t>[2] J. Ispahany. RADAR: Datasets, scripts and code for advancing Ransomware Detection. Zenodo, doi:10.5281/zenodo.14564541.</w:t>
       </w:r>
     </w:p>
     <w:p>
@@ -2626,7 +2799,7 @@
           <w:rFonts w:ascii="Calibri" w:hAnsi="Calibri"/>
           <w:sz w:val="18"/>
         </w:rPr>
-        <w:t>[3] M. M. Breunig et al. LOF: Identifying Density-Based Local Outliers. SIGMOD Record, 2000.</w:t>
+        <w:t>[3] F. T. Liu, K. M. Ting, and Z.-H. Zhou. Isolation Forest. 2008 IEEE International Conference on Data Mining, 2008.</w:t>
       </w:r>
     </w:p>
     <w:p>
@@ -2639,7 +2812,7 @@
           <w:rFonts w:ascii="Calibri" w:hAnsi="Calibri"/>
           <w:sz w:val="18"/>
         </w:rPr>
-        <w:t>[4] L. Breiman. Random Forests. Machine Learning, 2001.</w:t>
+        <w:t>[4] M. M. Breunig et al. LOF: Identifying Density-Based Local Outliers. SIGMOD Record, 2000.</w:t>
       </w:r>
     </w:p>
     <w:p>
@@ -2652,7 +2825,20 @@
           <w:rFonts w:ascii="Calibri" w:hAnsi="Calibri"/>
           <w:sz w:val="18"/>
         </w:rPr>
-        <w:t>[5] M. A. F. da Costa et al. A systematic review of ransomware detection approaches. Computers &amp; Security, 2023.</w:t>
+        <w:t>[5] L. Breiman. Random Forests. Machine Learning, 2001.</w:t>
+      </w:r>
+    </w:p>
+    <w:p>
+      <w:pPr>
+        <w:spacing w:after="60"/>
+        <w:ind w:left="259" w:hanging="259"/>
+      </w:pPr>
+      <w:r>
+        <w:rPr>
+          <w:rFonts w:ascii="Calibri" w:hAnsi="Calibri"/>
+          <w:sz w:val="18"/>
+        </w:rPr>
+        <w:t>[6] M. A. F. da Costa et al. A systematic review of ransomware detection approaches. Computers &amp; Security, 2023.</w:t>
       </w:r>
     </w:p>
     <w:sectPr>

</xml_diff>